<commit_message>
Add PiN parameters step 1 hybrid for Somalia___SOM
</commit_message>
<xml_diff>
--- a/platform_PiN_output/Somalia___SOM/Param_step1_Somalia___SOM_1022_12PM.docx
+++ b/platform_PiN_output/Somalia___SOM/Param_step1_Somalia___SOM_1022_12PM.docx
@@ -31,7 +31,7 @@
         <w:pStyle w:val="ListBullet"/>
       </w:pPr>
       <w:r>
-        <w:t>Date calculation: 22/10/2025 12:45</w:t>
+        <w:t>Date calculation: 22/10/2025 12:54</w:t>
       </w:r>
     </w:p>
     <w:p>
@@ -211,7 +211,7 @@
         <w:pStyle w:val="ListBullet2"/>
       </w:pPr>
       <w:r>
-        <w:t xml:space="preserve">      Pregnancy</w:t>
+        <w:t xml:space="preserve">      Child is associated with armed forces or armed groups</w:t>
       </w:r>
     </w:p>
     <w:p>
@@ -219,7 +219,7 @@
         <w:pStyle w:val="ListBullet2"/>
       </w:pPr>
       <w:r>
-        <w:t xml:space="preserve">      Child is associated with armed forces or armed groups</w:t>
+        <w:t xml:space="preserve">      Pregnancy</w:t>
       </w:r>
     </w:p>
     <w:p>

</xml_diff>